<commit_message>
self-check set + READMEs: review fixes — paste-first everywhere, seven real entries (Lumley is a real book), scope-extension label, venue guards incl. JSLW, .docx regenerated, rule keys corrected
Co-Authored-By: Claude Fable 5.1 <noreply@anthropic.com>
</commit_message>
<xml_diff>
--- a/standalone/citation-integrity/citation-checklist-for-students.docx
+++ b/standalone/citation-integrity/citation-checklist-for-students.docx
@@ -2,13 +2,13 @@
 <file path=word/document.xml><?xml version="1.0" encoding="utf-8"?>
 <w:document xmlns:w="http://schemas.openxmlformats.org/wordprocessingml/2006/main" xmlns:m="http://schemas.openxmlformats.org/officeDocument/2006/math" xmlns:r="http://schemas.openxmlformats.org/officeDocument/2006/relationships" xmlns:o="urn:schemas-microsoft-com:office:office" xmlns:v="urn:schemas-microsoft-com:vml" xmlns:w10="urn:schemas-microsoft-com:office:word" xmlns:a="http://schemas.openxmlformats.org/drawingml/2006/main" xmlns:pic="http://schemas.openxmlformats.org/drawingml/2006/picture" xmlns:wp="http://schemas.openxmlformats.org/drawingml/2006/wordprocessingDrawing">
   <w:body>
-    <w:bookmarkStart w:id="15" w:name="X3167ddffd2fe579ecb8a2ddbc5dd42792c89fd6"/>
+    <w:bookmarkStart w:id="15" w:name="X51ec42c220b03b11a0e5a667e44452ffdb492fa"/>
     <w:p>
       <w:pPr>
         <w:pStyle w:val="Heading1"/>
       </w:pPr>
       <w:r>
-        <w:t>Citation integrity — a practice checklist for research students and their supervisors</w:t>
+        <w:t xml:space="preserve">Citation integrity — a practice checklist for research students and their supervisors</w:t>
       </w:r>
     </w:p>
     <w:p>
@@ -162,51 +162,45 @@
           <w:b/>
           <w:bCs/>
         </w:rPr>
-        <w:t xml:space="preserve">Attribute concepts in the source’s own terms.</w:t>
-      </w:r>
-      <w:r>
-        <w:t xml:space="preserve"> </w:t>
-      </w:r>
-      <w:r>
-        <w:t xml:space="preserve">Before writing</w:t>
-      </w:r>
-      <w:r>
-        <w:t xml:space="preserve"> </w:t>
-      </w:r>
-      <w:r>
-        <w:t xml:space="preserve">“X proposed ⟨your concept⟩,”</w:t>
-      </w:r>
-      <w:r>
-        <w:t xml:space="preserve"> </w:t>
-      </w:r>
-      <w:r>
-        <w:t xml:space="preserve">check that the source actually</w:t>
-      </w:r>
-      <w:r>
-        <w:t xml:space="preserve"> </w:t>
-      </w:r>
-      <w:r>
-        <w:rPr>
-          <w:i/>
-          <w:iCs/>
-        </w:rPr>
-        <w:t xml:space="preserve">develops</w:t>
-      </w:r>
-      <w:r>
-        <w:t xml:space="preserve"> </w:t>
-      </w:r>
-      <w:r>
-        <w:t xml:space="preserve">that concept — not a neighbouring idea you’re reframing in your own vocabulary. A quick honesty test: could you quote a sentence where the authors say it themselves? (Watch the dates, too: if your concept postdates the paper you’re attaching it to, something is off.)</w:t>
-      </w:r>
-      <w:r>
-        <w:t xml:space="preserve"> </w:t>
-      </w:r>
-      <w:r>
-        <w:rPr>
-          <w:i/>
-          <w:iCs/>
-        </w:rPr>
-        <w:t xml:space="preserve">(rule 1)</w:t>
+        <w:t xml:space="preserve">Treat an under-review preprint as provisional, not proof.</w:t>
+      </w:r>
+      <w:r>
+        <w:t xml:space="preserve"> </w:t>
+      </w:r>
+      <w:r>
+        <w:t xml:space="preserve">A preprint that hasn’t passed peer review may change between versions — or never be accepted. Cite it</w:t>
+      </w:r>
+      <w:r>
+        <w:t xml:space="preserve"> </w:t>
+      </w:r>
+      <w:r>
+        <w:rPr>
+          <w:i/>
+          <w:iCs/>
+        </w:rPr>
+        <w:t xml:space="preserve">as</w:t>
+      </w:r>
+      <w:r>
+        <w:t xml:space="preserve"> </w:t>
+      </w:r>
+      <w:r>
+        <w:t xml:space="preserve">a preprint, say so in your prose (</w:t>
+      </w:r>
+      <w:r>
+        <w:t xml:space="preserve">“in a preprint, X report…”</w:t>
+      </w:r>
+      <w:r>
+        <w:t xml:space="preserve">), and never let a single unreviewed finding — however striking, and frontier-model results are especially tempting — carry a load-bearing claim on its own. Before submitting, check whether a peer-reviewed version now exists, and whether your target journal has a policy on citing preprints (some require explicit labelling; a few restrict them for key claims).</w:t>
+      </w:r>
+      <w:r>
+        <w:t xml:space="preserve"> </w:t>
+      </w:r>
+      <w:r>
+        <w:rPr>
+          <w:i/>
+          <w:iCs/>
+        </w:rPr>
+        <w:t xml:space="preserve">(rules 4, 7, 14)</w:t>
       </w:r>
     </w:p>
     <w:p>
@@ -222,23 +216,51 @@
           <w:b/>
           <w:bCs/>
         </w:rPr>
-        <w:t xml:space="preserve">Quote with a locator.</w:t>
-      </w:r>
-      <w:r>
-        <w:t xml:space="preserve"> </w:t>
-      </w:r>
-      <w:r>
-        <w:t xml:space="preserve">Every direct quotation carries a page or section number, checked against the source — not from memory.</w:t>
-      </w:r>
-      <w:r>
-        <w:t xml:space="preserve"> </w:t>
-      </w:r>
-      <w:r>
-        <w:rPr>
-          <w:i/>
-          <w:iCs/>
-        </w:rPr>
-        <w:t xml:space="preserve">(rule 9)</w:t>
+        <w:t xml:space="preserve">Attribute concepts in the source’s own terms.</w:t>
+      </w:r>
+      <w:r>
+        <w:t xml:space="preserve"> </w:t>
+      </w:r>
+      <w:r>
+        <w:t xml:space="preserve">Before writing</w:t>
+      </w:r>
+      <w:r>
+        <w:t xml:space="preserve"> </w:t>
+      </w:r>
+      <w:r>
+        <w:t xml:space="preserve">“X proposed ⟨your concept⟩,”</w:t>
+      </w:r>
+      <w:r>
+        <w:t xml:space="preserve"> </w:t>
+      </w:r>
+      <w:r>
+        <w:t xml:space="preserve">check that the source actually</w:t>
+      </w:r>
+      <w:r>
+        <w:t xml:space="preserve"> </w:t>
+      </w:r>
+      <w:r>
+        <w:rPr>
+          <w:i/>
+          <w:iCs/>
+        </w:rPr>
+        <w:t xml:space="preserve">develops</w:t>
+      </w:r>
+      <w:r>
+        <w:t xml:space="preserve"> </w:t>
+      </w:r>
+      <w:r>
+        <w:t xml:space="preserve">that concept — not a neighbouring idea you’re reframing in your own vocabulary. A quick honesty test: could you quote a sentence where the authors say it themselves? (Watch the dates, too: if your concept postdates the paper you’re attaching it to, something is off.)</w:t>
+      </w:r>
+      <w:r>
+        <w:t xml:space="preserve"> </w:t>
+      </w:r>
+      <w:r>
+        <w:rPr>
+          <w:i/>
+          <w:iCs/>
+        </w:rPr>
+        <w:t xml:space="preserve">(rule 1)</w:t>
       </w:r>
     </w:p>
     <w:p>
@@ -254,6 +276,38 @@
           <w:b/>
           <w:bCs/>
         </w:rPr>
+        <w:t xml:space="preserve">Quote with a locator.</w:t>
+      </w:r>
+      <w:r>
+        <w:t xml:space="preserve"> </w:t>
+      </w:r>
+      <w:r>
+        <w:t xml:space="preserve">Every direct quotation carries a page or section number, checked against the source — not from memory.</w:t>
+      </w:r>
+      <w:r>
+        <w:t xml:space="preserve"> </w:t>
+      </w:r>
+      <w:r>
+        <w:rPr>
+          <w:i/>
+          <w:iCs/>
+        </w:rPr>
+        <w:t xml:space="preserve">(rule 9)</w:t>
+      </w:r>
+    </w:p>
+    <w:p>
+      <w:pPr>
+        <w:pStyle w:val="Compact"/>
+        <w:numPr>
+          <w:ilvl w:val="0"/>
+          <w:numId w:val="1001"/>
+        </w:numPr>
+      </w:pPr>
+      <w:r>
+        <w:rPr>
+          <w:b/>
+          <w:bCs/>
+        </w:rPr>
         <w:t xml:space="preserve">Never let anyone — or any AI — supply a reference you haven’t read.</w:t>
       </w:r>
       <w:r>
@@ -559,7 +613,7 @@
           <w:i/>
           <w:iCs/>
         </w:rPr>
-        <w:t xml:space="preserve">(rules 3, 10)</w:t>
+        <w:t xml:space="preserve">(rules 3, 4)</w:t>
       </w:r>
     </w:p>
     <w:p>
@@ -667,7 +721,23 @@
         <w:t xml:space="preserve"> </w:t>
       </w:r>
       <w:r>
-        <w:t xml:space="preserve">— in the authors’ own terms? And is the evidence strong enough to carry it alone?</w:t>
+        <w:t xml:space="preserve">— in the authors’ own terms? And is the evidence strong enough to carry it alone? Then let the companion AI file check the</w:t>
+      </w:r>
+      <w:r>
+        <w:t xml:space="preserve"> </w:t>
+      </w:r>
+      <w:r>
+        <w:rPr>
+          <w:i/>
+          <w:iCs/>
+        </w:rPr>
+        <w:t xml:space="preserve">rest</w:t>
+      </w:r>
+      <w:r>
+        <w:t xml:space="preserve"> </w:t>
+      </w:r>
+      <w:r>
+        <w:t xml:space="preserve">against their abstracts — mis-attached claims hide in the routine supporting citations, not only the load-bearing ones.</w:t>
       </w:r>
       <w:r>
         <w:t xml:space="preserve"> </w:t>
@@ -696,7 +766,7 @@
         <w:t xml:space="preserve">The venue’s AI-use policy is checked and your declaration written</w:t>
       </w:r>
       <w:r>
-        <w:t xml:space="preserve">, if you used AI anywhere in the work.</w:t>
+        <w:t xml:space="preserve">, if you used AI anywhere in the work. A complete statement names the tool and model version, what it was used for (which stage of the work), and how you verified its output — the elements methodologists now ask for (Jay et al., 2026).</w:t>
       </w:r>
       <w:r>
         <w:t xml:space="preserve"> </w:t>
@@ -724,7 +794,7 @@
         <w:pStyle w:val="FirstParagraph"/>
       </w:pPr>
       <w:r>
-        <w:t xml:space="preserve">Every un-ticked box above is checkable in minutes by an AI assistant: paste the companion file</w:t>
+        <w:t xml:space="preserve">The mechanical boxes above are checkable in minutes by an AI assistant — the judgement boxes remain yours: paste the companion file</w:t>
       </w:r>
       <w:r>
         <w:t xml:space="preserve"> </w:t>
@@ -770,6 +840,27 @@
     <w:p>
       <w:pPr>
         <w:pStyle w:val="FirstParagraph"/>
+      </w:pPr>
+      <w:r>
+        <w:t xml:space="preserve">Reference: Jay, M., Abi-Jaoude, J., Straus, S. E., Eskander, A., Lipscombe, L., Dharma, C., &amp; Yu, C. (2026). Moving towards acceleration with accountability: A conceptual framework for AI-assisted systematic reviews.</w:t>
+      </w:r>
+      <w:r>
+        <w:t xml:space="preserve"> </w:t>
+      </w:r>
+      <w:r>
+        <w:rPr>
+          <w:i/>
+          <w:iCs/>
+        </w:rPr>
+        <w:t xml:space="preserve">Global Epidemiology, 12</w:t>
+      </w:r>
+      <w:r>
+        <w:t xml:space="preserve">, 100282. https://doi.org/10.1016/j.gloepi.2026.100282</w:t>
+      </w:r>
+    </w:p>
+    <w:p>
+      <w:pPr>
+        <w:pStyle w:val="BodyText"/>
       </w:pPr>
       <w:r>
         <w:rPr>

</xml_diff>

<commit_message>
docs + skills: Crosthwaite & Özer (2026) placements — reporting section in docs/00, prompts-are-the-instrument ground rule, second warrant for pinning/re-testing, radar run stamp, protocol diagnosis triad, checklist example (+ .docx)
Co-Authored-By: Claude Fable 5.1 <noreply@anthropic.com>
</commit_message>
<xml_diff>
--- a/standalone/citation-integrity/citation-checklist-for-students.docx
+++ b/standalone/citation-integrity/citation-checklist-for-students.docx
@@ -766,7 +766,23 @@
         <w:t xml:space="preserve">The venue’s AI-use policy is checked and your declaration written</w:t>
       </w:r>
       <w:r>
-        <w:t xml:space="preserve">, if you used AI anywhere in the work. A complete statement names the tool and model version, what it was used for (which stage of the work), and how you verified its output — the elements methodologists now ask for (Jay et al., 2026).</w:t>
+        <w:t xml:space="preserve">, if you used AI anywhere in the work. A complete statement names the tool and model version, what it was used for (which stage of the work), and how you verified its output — the elements methodologists now ask for (Jay et al., 2026). For a published example in applied linguistics, see the</w:t>
+      </w:r>
+      <w:r>
+        <w:t xml:space="preserve"> </w:t>
+      </w:r>
+      <w:r>
+        <w:rPr>
+          <w:i/>
+          <w:iCs/>
+        </w:rPr>
+        <w:t xml:space="preserve">Generative AI statement</w:t>
+      </w:r>
+      <w:r>
+        <w:t xml:space="preserve"> </w:t>
+      </w:r>
+      <w:r>
+        <w:t xml:space="preserve">in Crosthwaite &amp; Özer (2026, https://doi.org/10.1016/j.rmal.2026.100356): tools, versions, and the exact uses, in two sentences.</w:t>
       </w:r>
       <w:r>
         <w:t xml:space="preserve"> </w:t>

</xml_diff>

<commit_message>
charter v3 (2.0.0 candidate): extend rules 1, 4, 7, 15 and the ground rule; count unchanged
Applied on release/2.0.0 for re-testing; not released. Rule 15 gains a
commitment of the kit itself, worded by aim with a request-triggered refusal and
a purpose-conditional carve-out for voice restoration; pointers sit on the
declaration sentences of the skills and docs, never restating the rule. Skills'
'enforce all' and 'operationalise' claims softened to what a check can reach.
Students' checklist extended; .docx regenerated. Rule count stays at sixteen.

Co-Authored-By: Claude Opus 5.5 <noreply@anthropic.com>
</commit_message>
<xml_diff>
--- a/standalone/citation-integrity/citation-checklist-for-students.docx
+++ b/standalone/citation-integrity/citation-checklist-for-students.docx
@@ -44,7 +44,7 @@
           <w:i/>
           <w:iCs/>
         </w:rPr>
-        <w:t xml:space="preserve">, which remains the authority.</w:t>
+        <w:t xml:space="preserve">, or to its ground rule; the charter remains the authority.</w:t>
       </w:r>
     </w:p>
     <w:bookmarkStart w:id="10" w:name="the-habits-while-you-read-and-write"/>
@@ -114,39 +114,33 @@
           <w:b/>
           <w:bCs/>
         </w:rPr>
-        <w:t xml:space="preserve">Cite the version you actually used</w:t>
-      </w:r>
-      <w:r>
-        <w:t xml:space="preserve"> </w:t>
-      </w:r>
-      <w:r>
-        <w:t xml:space="preserve">— the edition, the translation, the preprint</w:t>
-      </w:r>
-      <w:r>
-        <w:t xml:space="preserve"> </w:t>
-      </w:r>
-      <w:r>
-        <w:rPr>
-          <w:i/>
-          <w:iCs/>
-        </w:rPr>
-        <w:t xml:space="preserve">or</w:t>
-      </w:r>
-      <w:r>
-        <w:t xml:space="preserve"> </w:t>
-      </w:r>
-      <w:r>
-        <w:t xml:space="preserve">the published version, whichever you read. When a preprint you cited gets published, update to the version of record.</w:t>
-      </w:r>
-      <w:r>
-        <w:t xml:space="preserve"> </w:t>
-      </w:r>
-      <w:r>
-        <w:rPr>
-          <w:i/>
-          <w:iCs/>
-        </w:rPr>
-        <w:t xml:space="preserve">(rules 4, 14)</w:t>
+        <w:t xml:space="preserve">Find every statistic in the study you credit.</w:t>
+      </w:r>
+      <w:r>
+        <w:t xml:space="preserve"> </w:t>
+      </w:r>
+      <w:r>
+        <w:t xml:space="preserve">Before a number goes beside a citation, find it in that study, or say in your sentence that you calculated it from that study’s data. If you took it from a summary, cite the summary (</w:t>
+      </w:r>
+      <w:r>
+        <w:rPr>
+          <w:i/>
+          <w:iCs/>
+        </w:rPr>
+        <w:t xml:space="preserve">as cited in</w:t>
+      </w:r>
+      <w:r>
+        <w:t xml:space="preserve">).</w:t>
+      </w:r>
+      <w:r>
+        <w:t xml:space="preserve"> </w:t>
+      </w:r>
+      <w:r>
+        <w:rPr>
+          <w:i/>
+          <w:iCs/>
+        </w:rPr>
+        <w:t xml:space="preserve">(rules 1, 5)</w:t>
       </w:r>
     </w:p>
     <w:p>
@@ -162,45 +156,39 @@
           <w:b/>
           <w:bCs/>
         </w:rPr>
-        <w:t xml:space="preserve">Treat an under-review preprint as provisional, not proof.</w:t>
-      </w:r>
-      <w:r>
-        <w:t xml:space="preserve"> </w:t>
-      </w:r>
-      <w:r>
-        <w:t xml:space="preserve">A preprint that hasn’t passed peer review may change between versions — or never be accepted. Cite it</w:t>
-      </w:r>
-      <w:r>
-        <w:t xml:space="preserve"> </w:t>
-      </w:r>
-      <w:r>
-        <w:rPr>
-          <w:i/>
-          <w:iCs/>
-        </w:rPr>
-        <w:t xml:space="preserve">as</w:t>
-      </w:r>
-      <w:r>
-        <w:t xml:space="preserve"> </w:t>
-      </w:r>
-      <w:r>
-        <w:t xml:space="preserve">a preprint, say so in your prose (</w:t>
-      </w:r>
-      <w:r>
-        <w:t xml:space="preserve">“in a preprint, X report…”</w:t>
-      </w:r>
-      <w:r>
-        <w:t xml:space="preserve">), and never let a single unreviewed finding — however striking, and frontier-model results are especially tempting — carry a load-bearing claim on its own. Before submitting, check whether a peer-reviewed version now exists, and whether your target journal has a policy on citing preprints (some require explicit labelling; a few restrict them for key claims).</w:t>
-      </w:r>
-      <w:r>
-        <w:t xml:space="preserve"> </w:t>
-      </w:r>
-      <w:r>
-        <w:rPr>
-          <w:i/>
-          <w:iCs/>
-        </w:rPr>
-        <w:t xml:space="preserve">(rules 4, 7, 14)</w:t>
+        <w:t xml:space="preserve">Cite the version you actually used</w:t>
+      </w:r>
+      <w:r>
+        <w:t xml:space="preserve"> </w:t>
+      </w:r>
+      <w:r>
+        <w:t xml:space="preserve">— the edition, the translation, the preprint</w:t>
+      </w:r>
+      <w:r>
+        <w:t xml:space="preserve"> </w:t>
+      </w:r>
+      <w:r>
+        <w:rPr>
+          <w:i/>
+          <w:iCs/>
+        </w:rPr>
+        <w:t xml:space="preserve">or</w:t>
+      </w:r>
+      <w:r>
+        <w:t xml:space="preserve"> </w:t>
+      </w:r>
+      <w:r>
+        <w:t xml:space="preserve">the published version, whichever you read. When a preprint you cited gets published, update to the version of record. Check the record’s authors, year and pages against that copy’s title page or first page.</w:t>
+      </w:r>
+      <w:r>
+        <w:t xml:space="preserve"> </w:t>
+      </w:r>
+      <w:r>
+        <w:rPr>
+          <w:i/>
+          <w:iCs/>
+        </w:rPr>
+        <w:t xml:space="preserve">(rules 4, 14)</w:t>
       </w:r>
     </w:p>
     <w:p>
@@ -216,51 +204,45 @@
           <w:b/>
           <w:bCs/>
         </w:rPr>
-        <w:t xml:space="preserve">Attribute concepts in the source’s own terms.</w:t>
-      </w:r>
-      <w:r>
-        <w:t xml:space="preserve"> </w:t>
-      </w:r>
-      <w:r>
-        <w:t xml:space="preserve">Before writing</w:t>
-      </w:r>
-      <w:r>
-        <w:t xml:space="preserve"> </w:t>
-      </w:r>
-      <w:r>
-        <w:t xml:space="preserve">“X proposed ⟨your concept⟩,”</w:t>
-      </w:r>
-      <w:r>
-        <w:t xml:space="preserve"> </w:t>
-      </w:r>
-      <w:r>
-        <w:t xml:space="preserve">check that the source actually</w:t>
-      </w:r>
-      <w:r>
-        <w:t xml:space="preserve"> </w:t>
-      </w:r>
-      <w:r>
-        <w:rPr>
-          <w:i/>
-          <w:iCs/>
-        </w:rPr>
-        <w:t xml:space="preserve">develops</w:t>
-      </w:r>
-      <w:r>
-        <w:t xml:space="preserve"> </w:t>
-      </w:r>
-      <w:r>
-        <w:t xml:space="preserve">that concept — not a neighbouring idea you’re reframing in your own vocabulary. A quick honesty test: could you quote a sentence where the authors say it themselves? (Watch the dates, too: if your concept postdates the paper you’re attaching it to, something is off.)</w:t>
-      </w:r>
-      <w:r>
-        <w:t xml:space="preserve"> </w:t>
-      </w:r>
-      <w:r>
-        <w:rPr>
-          <w:i/>
-          <w:iCs/>
-        </w:rPr>
-        <w:t xml:space="preserve">(rule 1)</w:t>
+        <w:t xml:space="preserve">Treat an under-review preprint as provisional, not proof.</w:t>
+      </w:r>
+      <w:r>
+        <w:t xml:space="preserve"> </w:t>
+      </w:r>
+      <w:r>
+        <w:t xml:space="preserve">A preprint that hasn’t passed peer review may change between versions — or never be accepted. Cite it</w:t>
+      </w:r>
+      <w:r>
+        <w:t xml:space="preserve"> </w:t>
+      </w:r>
+      <w:r>
+        <w:rPr>
+          <w:i/>
+          <w:iCs/>
+        </w:rPr>
+        <w:t xml:space="preserve">as</w:t>
+      </w:r>
+      <w:r>
+        <w:t xml:space="preserve"> </w:t>
+      </w:r>
+      <w:r>
+        <w:t xml:space="preserve">a preprint, say so in your prose (</w:t>
+      </w:r>
+      <w:r>
+        <w:t xml:space="preserve">“in a preprint, X report…”</w:t>
+      </w:r>
+      <w:r>
+        <w:t xml:space="preserve">), and never let a single unreviewed finding — however striking, and frontier-model results are especially tempting — carry a load-bearing claim on its own. Before submitting, check whether a peer-reviewed version now exists, and whether your target journal has a policy on citing preprints (some require explicit labelling; a few restrict them for key claims).</w:t>
+      </w:r>
+      <w:r>
+        <w:t xml:space="preserve"> </w:t>
+      </w:r>
+      <w:r>
+        <w:rPr>
+          <w:i/>
+          <w:iCs/>
+        </w:rPr>
+        <w:t xml:space="preserve">(rules 4, 7, 14)</w:t>
       </w:r>
     </w:p>
     <w:p>
@@ -276,23 +258,51 @@
           <w:b/>
           <w:bCs/>
         </w:rPr>
-        <w:t xml:space="preserve">Quote with a locator.</w:t>
-      </w:r>
-      <w:r>
-        <w:t xml:space="preserve"> </w:t>
-      </w:r>
-      <w:r>
-        <w:t xml:space="preserve">Every direct quotation carries a page or section number, checked against the source — not from memory.</w:t>
-      </w:r>
-      <w:r>
-        <w:t xml:space="preserve"> </w:t>
-      </w:r>
-      <w:r>
-        <w:rPr>
-          <w:i/>
-          <w:iCs/>
-        </w:rPr>
-        <w:t xml:space="preserve">(rule 9)</w:t>
+        <w:t xml:space="preserve">Attribute concepts in the source’s own terms.</w:t>
+      </w:r>
+      <w:r>
+        <w:t xml:space="preserve"> </w:t>
+      </w:r>
+      <w:r>
+        <w:t xml:space="preserve">Before writing</w:t>
+      </w:r>
+      <w:r>
+        <w:t xml:space="preserve"> </w:t>
+      </w:r>
+      <w:r>
+        <w:t xml:space="preserve">“X proposed ⟨your concept⟩,”</w:t>
+      </w:r>
+      <w:r>
+        <w:t xml:space="preserve"> </w:t>
+      </w:r>
+      <w:r>
+        <w:t xml:space="preserve">check that the source actually</w:t>
+      </w:r>
+      <w:r>
+        <w:t xml:space="preserve"> </w:t>
+      </w:r>
+      <w:r>
+        <w:rPr>
+          <w:i/>
+          <w:iCs/>
+        </w:rPr>
+        <w:t xml:space="preserve">develops</w:t>
+      </w:r>
+      <w:r>
+        <w:t xml:space="preserve"> </w:t>
+      </w:r>
+      <w:r>
+        <w:t xml:space="preserve">that concept — not a neighbouring idea you’re reframing in your own vocabulary. A quick honesty test: could you quote a sentence where the authors say it themselves? (Watch the dates, too: if your concept postdates the paper you’re attaching it to, something is off.)</w:t>
+      </w:r>
+      <w:r>
+        <w:t xml:space="preserve"> </w:t>
+      </w:r>
+      <w:r>
+        <w:rPr>
+          <w:i/>
+          <w:iCs/>
+        </w:rPr>
+        <w:t xml:space="preserve">(rule 1)</w:t>
       </w:r>
     </w:p>
     <w:p>
@@ -308,6 +318,76 @@
           <w:b/>
           <w:bCs/>
         </w:rPr>
+        <w:t xml:space="preserve">Claims about what everyone does need evidence too.</w:t>
+      </w:r>
+      <w:r>
+        <w:t xml:space="preserve"> </w:t>
+      </w:r>
+      <w:r>
+        <w:t xml:space="preserve">“Standard practice”</w:t>
+      </w:r>
+      <w:r>
+        <w:t xml:space="preserve"> </w:t>
+      </w:r>
+      <w:r>
+        <w:t xml:space="preserve">needs a review or survey behind it, or rewording as your own argument.</w:t>
+      </w:r>
+      <w:r>
+        <w:t xml:space="preserve"> </w:t>
+      </w:r>
+      <w:r>
+        <w:rPr>
+          <w:i/>
+          <w:iCs/>
+        </w:rPr>
+        <w:t xml:space="preserve">(ground rule)</w:t>
+      </w:r>
+    </w:p>
+    <w:p>
+      <w:pPr>
+        <w:pStyle w:val="Compact"/>
+        <w:numPr>
+          <w:ilvl w:val="0"/>
+          <w:numId w:val="1001"/>
+        </w:numPr>
+      </w:pPr>
+      <w:r>
+        <w:rPr>
+          <w:b/>
+          <w:bCs/>
+        </w:rPr>
+        <w:t xml:space="preserve">Quote with a locator.</w:t>
+      </w:r>
+      <w:r>
+        <w:t xml:space="preserve"> </w:t>
+      </w:r>
+      <w:r>
+        <w:t xml:space="preserve">Every direct quotation carries a page or section number, checked against the source — not from memory.</w:t>
+      </w:r>
+      <w:r>
+        <w:t xml:space="preserve"> </w:t>
+      </w:r>
+      <w:r>
+        <w:rPr>
+          <w:i/>
+          <w:iCs/>
+        </w:rPr>
+        <w:t xml:space="preserve">(rule 9)</w:t>
+      </w:r>
+    </w:p>
+    <w:p>
+      <w:pPr>
+        <w:pStyle w:val="Compact"/>
+        <w:numPr>
+          <w:ilvl w:val="0"/>
+          <w:numId w:val="1001"/>
+        </w:numPr>
+      </w:pPr>
+      <w:r>
+        <w:rPr>
+          <w:b/>
+          <w:bCs/>
+        </w:rPr>
         <w:t xml:space="preserve">Never let anyone — or any AI — supply a reference you haven’t read.</w:t>
       </w:r>
       <w:r>
@@ -721,7 +801,7 @@
         <w:t xml:space="preserve"> </w:t>
       </w:r>
       <w:r>
-        <w:t xml:space="preserve">— in the authors’ own terms? And is the evidence strong enough to carry it alone? Then let the companion AI file check the</w:t>
+        <w:t xml:space="preserve">— in the authors’ own terms? And is the evidence strong enough to carry it alone? Give the studies that disagree with you the same careful reading. Then let the companion AI file check the</w:t>
       </w:r>
       <w:r>
         <w:t xml:space="preserve"> </w:t>

</xml_diff>